<commit_message>
Lesson 67 Fixing Checkout Issues
</commit_message>
<xml_diff>
--- a/Bugs to solve.docx
+++ b/Bugs to solve.docx
@@ -44,7 +44,27 @@
         <w:t xml:space="preserve"> page.</w:t>
       </w:r>
     </w:p>
-    <w:p/>
+    <w:p>
+      <w:pPr>
+        <w:pStyle w:val="ListParagraph"/>
+        <w:numPr>
+          <w:ilvl w:val="0"/>
+          <w:numId w:val="1"/>
+        </w:numPr>
+      </w:pPr>
+      <w:r>
+        <w:t>Lesson 67 8:00 to 10:00 amount =0 ca t undefined (how).</w:t>
+      </w:r>
+    </w:p>
+    <w:p>
+      <w:pPr>
+        <w:pStyle w:val="ListParagraph"/>
+        <w:numPr>
+          <w:ilvl w:val="0"/>
+          <w:numId w:val="1"/>
+        </w:numPr>
+      </w:pPr>
+    </w:p>
     <w:sectPr>
       <w:pgSz w:w="11906" w:h="16838"/>
       <w:pgMar w:top="1440" w:right="1440" w:bottom="1440" w:left="1440" w:header="708" w:footer="708" w:gutter="0"/>

</xml_diff>

<commit_message>
Lesson 73 Creating Forgot Password Page
</commit_message>
<xml_diff>
--- a/Bugs to solve.docx
+++ b/Bugs to solve.docx
@@ -54,6 +54,32 @@
       </w:pPr>
       <w:r>
         <w:t>Lesson 67 8:00 to 10:00 amount =0 ca t undefined (how).</w:t>
+      </w:r>
+    </w:p>
+    <w:p>
+      <w:pPr>
+        <w:pStyle w:val="ListParagraph"/>
+        <w:numPr>
+          <w:ilvl w:val="0"/>
+          <w:numId w:val="1"/>
+        </w:numPr>
+      </w:pPr>
+      <w:r>
+        <w:t xml:space="preserve">Could not solve the sidebar css tailwind style of booming sliding sidebar which appear like it is growing in mobile </w:t>
+      </w:r>
+      <w:proofErr w:type="gramStart"/>
+      <w:r>
+        <w:t>view</w:t>
+      </w:r>
+      <w:r>
+        <w:t>.(</w:t>
+      </w:r>
+      <w:proofErr w:type="gramEnd"/>
+      <w:r>
+        <w:t>who knows</w:t>
+      </w:r>
+      <w:r>
+        <w:t>)</w:t>
       </w:r>
     </w:p>
     <w:p>

</xml_diff>